<commit_message>
Added the structure for base templates, resumes, contacts and components.
</commit_message>
<xml_diff>
--- a/Zvit/zvit 1.docx
+++ b/Zvit/zvit 1.docx
@@ -97,6 +97,7 @@
           <w:szCs w:val="28"/>
         </w:rPr>
       </w:pPr>
+      <w:proofErr w:type="spellStart"/>
       <w:r>
         <w:rPr>
           <w:rFonts w:ascii="Times New Roman" w:hAnsi="Times New Roman" w:cs="Times New Roman"/>
@@ -105,8 +106,31 @@
           <w:sz w:val="28"/>
           <w:szCs w:val="28"/>
         </w:rPr>
-        <w:t>Вебпрограмування мовою Python</w:t>
-      </w:r>
+        <w:t>Вебпрограмування</w:t>
+      </w:r>
+      <w:proofErr w:type="spellEnd"/>
+      <w:r>
+        <w:rPr>
+          <w:rFonts w:ascii="Times New Roman" w:hAnsi="Times New Roman" w:cs="Times New Roman"/>
+          <w:i/>
+          <w:iCs/>
+          <w:sz w:val="28"/>
+          <w:szCs w:val="28"/>
+        </w:rPr>
+        <w:t xml:space="preserve"> мовою </w:t>
+      </w:r>
+      <w:proofErr w:type="spellStart"/>
+      <w:r>
+        <w:rPr>
+          <w:rFonts w:ascii="Times New Roman" w:hAnsi="Times New Roman" w:cs="Times New Roman"/>
+          <w:i/>
+          <w:iCs/>
+          <w:sz w:val="28"/>
+          <w:szCs w:val="28"/>
+        </w:rPr>
+        <w:t>Python</w:t>
+      </w:r>
+      <w:proofErr w:type="spellEnd"/>
     </w:p>
     <w:p>
       <w:pPr>
@@ -246,7 +270,25 @@
           <w:sz w:val="28"/>
           <w:szCs w:val="28"/>
         </w:rPr>
-        <w:t>Найпростіший Flask-додаток</w:t>
+        <w:t xml:space="preserve">Найпростіший </w:t>
+      </w:r>
+      <w:proofErr w:type="spellStart"/>
+      <w:r>
+        <w:rPr>
+          <w:rFonts w:ascii="Times New Roman" w:hAnsi="Times New Roman" w:cs="Times New Roman"/>
+          <w:sz w:val="28"/>
+          <w:szCs w:val="28"/>
+        </w:rPr>
+        <w:t>Flask</w:t>
+      </w:r>
+      <w:proofErr w:type="spellEnd"/>
+      <w:r>
+        <w:rPr>
+          <w:rFonts w:ascii="Times New Roman" w:hAnsi="Times New Roman" w:cs="Times New Roman"/>
+          <w:sz w:val="28"/>
+          <w:szCs w:val="28"/>
+        </w:rPr>
+        <w:t>-додаток</w:t>
       </w:r>
       <w:r>
         <w:rPr>
@@ -791,9 +833,495 @@
     </w:p>
     <w:p>
       <w:pPr>
-        <w:spacing w:after="0"/>
-        <w:rPr>
+        <w:pStyle w:val="a9"/>
+        <w:numPr>
+          <w:ilvl w:val="0"/>
+          <w:numId w:val="2"/>
+        </w:numPr>
+        <w:spacing w:after="0"/>
+        <w:rPr>
+          <w:rFonts w:ascii="Times New Roman" w:hAnsi="Times New Roman" w:cs="Times New Roman"/>
+          <w:sz w:val="28"/>
+          <w:szCs w:val="28"/>
+        </w:rPr>
+      </w:pPr>
+      <w:r>
+        <w:rPr>
+          <w:rFonts w:ascii="Times New Roman" w:hAnsi="Times New Roman" w:cs="Times New Roman"/>
+          <w:sz w:val="28"/>
+          <w:szCs w:val="28"/>
+        </w:rPr>
+        <w:lastRenderedPageBreak/>
+        <w:t>Скріншот сторінки у браузері:</w:t>
+      </w:r>
+    </w:p>
+    <w:p>
+      <w:pPr>
+        <w:spacing w:after="0"/>
+        <w:rPr>
+          <w:rFonts w:ascii="Times New Roman" w:hAnsi="Times New Roman" w:cs="Times New Roman"/>
+          <w:sz w:val="28"/>
+          <w:szCs w:val="28"/>
+        </w:rPr>
+      </w:pPr>
+    </w:p>
+    <w:p>
+      <w:pPr>
+        <w:spacing w:after="0"/>
+        <w:jc w:val="center"/>
+        <w:rPr>
+          <w:rFonts w:ascii="Times New Roman" w:hAnsi="Times New Roman" w:cs="Times New Roman"/>
+          <w:sz w:val="28"/>
+          <w:szCs w:val="28"/>
+        </w:rPr>
+      </w:pPr>
+      <w:r>
+        <w:rPr>
+          <w:rFonts w:ascii="Times New Roman" w:hAnsi="Times New Roman" w:cs="Times New Roman"/>
+          <w:noProof/>
+          <w:sz w:val="28"/>
+          <w:szCs w:val="28"/>
+        </w:rPr>
+        <w:drawing>
+          <wp:inline distT="0" distB="0" distL="0" distR="0" wp14:anchorId="38078B1A" wp14:editId="566F4862">
+            <wp:extent cx="5734693" cy="3225800"/>
+            <wp:effectExtent l="0" t="0" r="0" b="0"/>
+            <wp:docPr id="1792942515" name="Рисунок 1"/>
+            <wp:cNvGraphicFramePr>
+              <a:graphicFrameLocks xmlns:a="http://schemas.openxmlformats.org/drawingml/2006/main" noChangeAspect="1"/>
+            </wp:cNvGraphicFramePr>
+            <a:graphic xmlns:a="http://schemas.openxmlformats.org/drawingml/2006/main">
+              <a:graphicData uri="http://schemas.openxmlformats.org/drawingml/2006/picture">
+                <pic:pic xmlns:pic="http://schemas.openxmlformats.org/drawingml/2006/picture">
+                  <pic:nvPicPr>
+                    <pic:cNvPr id="1792942515" name="Рисунок 1792942515"/>
+                    <pic:cNvPicPr/>
+                  </pic:nvPicPr>
+                  <pic:blipFill>
+                    <a:blip r:embed="rId5" cstate="print">
+                      <a:extLst>
+                        <a:ext uri="{28A0092B-C50C-407E-A947-70E740481C1C}">
+                          <a14:useLocalDpi xmlns:a14="http://schemas.microsoft.com/office/drawing/2010/main" val="0"/>
+                        </a:ext>
+                      </a:extLst>
+                    </a:blip>
+                    <a:stretch>
+                      <a:fillRect/>
+                    </a:stretch>
+                  </pic:blipFill>
+                  <pic:spPr>
+                    <a:xfrm>
+                      <a:off x="0" y="0"/>
+                      <a:ext cx="5822438" cy="3275157"/>
+                    </a:xfrm>
+                    <a:prstGeom prst="rect">
+                      <a:avLst/>
+                    </a:prstGeom>
+                  </pic:spPr>
+                </pic:pic>
+              </a:graphicData>
+            </a:graphic>
+          </wp:inline>
+        </w:drawing>
+      </w:r>
+    </w:p>
+    <w:p>
+      <w:pPr>
+        <w:spacing w:after="0"/>
+        <w:jc w:val="center"/>
+        <w:rPr>
+          <w:rFonts w:ascii="Times New Roman" w:hAnsi="Times New Roman" w:cs="Times New Roman"/>
+          <w:sz w:val="28"/>
+          <w:szCs w:val="28"/>
+        </w:rPr>
+      </w:pPr>
+    </w:p>
+    <w:p>
+      <w:pPr>
+        <w:pStyle w:val="a9"/>
+        <w:numPr>
+          <w:ilvl w:val="0"/>
+          <w:numId w:val="2"/>
+        </w:numPr>
+        <w:spacing w:after="0"/>
+        <w:jc w:val="both"/>
+        <w:rPr>
+          <w:rFonts w:ascii="Times New Roman" w:hAnsi="Times New Roman" w:cs="Times New Roman"/>
+          <w:sz w:val="28"/>
+          <w:szCs w:val="28"/>
+        </w:rPr>
+      </w:pPr>
+      <w:r>
+        <w:rPr>
+          <w:rFonts w:ascii="Times New Roman" w:hAnsi="Times New Roman" w:cs="Times New Roman"/>
+          <w:sz w:val="28"/>
+          <w:szCs w:val="28"/>
           <w:lang w:val="en-US"/>
+        </w:rPr>
+        <w:t>C</w:t>
+      </w:r>
+      <w:proofErr w:type="spellStart"/>
+      <w:r>
+        <w:rPr>
+          <w:rFonts w:ascii="Times New Roman" w:hAnsi="Times New Roman" w:cs="Times New Roman"/>
+          <w:sz w:val="28"/>
+          <w:szCs w:val="28"/>
+        </w:rPr>
+        <w:t>крін</w:t>
+      </w:r>
+      <w:r>
+        <w:rPr>
+          <w:rFonts w:ascii="Times New Roman" w:hAnsi="Times New Roman" w:cs="Times New Roman"/>
+          <w:sz w:val="28"/>
+          <w:szCs w:val="28"/>
+        </w:rPr>
+        <w:t>шот</w:t>
+      </w:r>
+      <w:proofErr w:type="spellEnd"/>
+      <w:r>
+        <w:rPr>
+          <w:rFonts w:ascii="Times New Roman" w:hAnsi="Times New Roman" w:cs="Times New Roman"/>
+          <w:sz w:val="28"/>
+          <w:szCs w:val="28"/>
+        </w:rPr>
+        <w:t xml:space="preserve"> </w:t>
+      </w:r>
+      <w:proofErr w:type="spellStart"/>
+      <w:r>
+        <w:rPr>
+          <w:rFonts w:ascii="Times New Roman" w:hAnsi="Times New Roman" w:cs="Times New Roman"/>
+          <w:sz w:val="28"/>
+          <w:szCs w:val="28"/>
+        </w:rPr>
+        <w:t>дашборду</w:t>
+      </w:r>
+      <w:proofErr w:type="spellEnd"/>
+      <w:r>
+        <w:rPr>
+          <w:rFonts w:ascii="Times New Roman" w:hAnsi="Times New Roman" w:cs="Times New Roman"/>
+          <w:sz w:val="28"/>
+          <w:szCs w:val="28"/>
+        </w:rPr>
+        <w:t xml:space="preserve"> у вашому профілі </w:t>
+      </w:r>
+      <w:proofErr w:type="spellStart"/>
+      <w:r>
+        <w:rPr>
+          <w:rFonts w:ascii="Times New Roman" w:hAnsi="Times New Roman" w:cs="Times New Roman"/>
+          <w:sz w:val="28"/>
+          <w:szCs w:val="28"/>
+        </w:rPr>
+        <w:t>Render</w:t>
+      </w:r>
+      <w:proofErr w:type="spellEnd"/>
+      <w:r>
+        <w:rPr>
+          <w:rFonts w:ascii="Times New Roman" w:hAnsi="Times New Roman" w:cs="Times New Roman"/>
+          <w:sz w:val="28"/>
+          <w:szCs w:val="28"/>
+          <w:lang w:val="en-US"/>
+        </w:rPr>
+        <w:t>:</w:t>
+      </w:r>
+    </w:p>
+    <w:p>
+      <w:pPr>
+        <w:spacing w:after="0"/>
+        <w:ind w:left="360"/>
+        <w:jc w:val="center"/>
+        <w:rPr>
+          <w:rFonts w:ascii="Times New Roman" w:hAnsi="Times New Roman" w:cs="Times New Roman"/>
+          <w:sz w:val="28"/>
+          <w:szCs w:val="28"/>
+        </w:rPr>
+      </w:pPr>
+    </w:p>
+    <w:p>
+      <w:pPr>
+        <w:spacing w:after="0"/>
+        <w:ind w:left="360"/>
+        <w:jc w:val="center"/>
+        <w:rPr>
+          <w:rFonts w:ascii="Times New Roman" w:hAnsi="Times New Roman" w:cs="Times New Roman"/>
+          <w:sz w:val="28"/>
+          <w:szCs w:val="28"/>
+          <w:lang w:val="en-US"/>
+        </w:rPr>
+      </w:pPr>
+      <w:r>
+        <w:rPr>
+          <w:rFonts w:ascii="Times New Roman" w:hAnsi="Times New Roman" w:cs="Times New Roman"/>
+          <w:noProof/>
+          <w:sz w:val="28"/>
+          <w:szCs w:val="28"/>
+          <w:lang w:val="en-US"/>
+        </w:rPr>
+        <w:drawing>
+          <wp:inline distT="0" distB="0" distL="0" distR="0" wp14:anchorId="1F80CC6B" wp14:editId="01EC0458">
+            <wp:extent cx="5892800" cy="3314739"/>
+            <wp:effectExtent l="0" t="0" r="0" b="0"/>
+            <wp:docPr id="1307611614" name="Рисунок 2"/>
+            <wp:cNvGraphicFramePr>
+              <a:graphicFrameLocks xmlns:a="http://schemas.openxmlformats.org/drawingml/2006/main" noChangeAspect="1"/>
+            </wp:cNvGraphicFramePr>
+            <a:graphic xmlns:a="http://schemas.openxmlformats.org/drawingml/2006/main">
+              <a:graphicData uri="http://schemas.openxmlformats.org/drawingml/2006/picture">
+                <pic:pic xmlns:pic="http://schemas.openxmlformats.org/drawingml/2006/picture">
+                  <pic:nvPicPr>
+                    <pic:cNvPr id="1307611614" name="Рисунок 1307611614"/>
+                    <pic:cNvPicPr/>
+                  </pic:nvPicPr>
+                  <pic:blipFill>
+                    <a:blip r:embed="rId6" cstate="print">
+                      <a:extLst>
+                        <a:ext uri="{28A0092B-C50C-407E-A947-70E740481C1C}">
+                          <a14:useLocalDpi xmlns:a14="http://schemas.microsoft.com/office/drawing/2010/main" val="0"/>
+                        </a:ext>
+                      </a:extLst>
+                    </a:blip>
+                    <a:stretch>
+                      <a:fillRect/>
+                    </a:stretch>
+                  </pic:blipFill>
+                  <pic:spPr>
+                    <a:xfrm>
+                      <a:off x="0" y="0"/>
+                      <a:ext cx="5976037" cy="3361561"/>
+                    </a:xfrm>
+                    <a:prstGeom prst="rect">
+                      <a:avLst/>
+                    </a:prstGeom>
+                  </pic:spPr>
+                </pic:pic>
+              </a:graphicData>
+            </a:graphic>
+          </wp:inline>
+        </w:drawing>
+      </w:r>
+    </w:p>
+    <w:p>
+      <w:pPr>
+        <w:rPr>
+          <w:rFonts w:ascii="Times New Roman" w:hAnsi="Times New Roman" w:cs="Times New Roman"/>
+          <w:sz w:val="28"/>
+          <w:szCs w:val="28"/>
+        </w:rPr>
+      </w:pPr>
+      <w:r>
+        <w:rPr>
+          <w:rFonts w:ascii="Times New Roman" w:hAnsi="Times New Roman" w:cs="Times New Roman"/>
+          <w:sz w:val="28"/>
+          <w:szCs w:val="28"/>
+          <w:lang w:val="en-US"/>
+        </w:rPr>
+        <w:br w:type="page"/>
+      </w:r>
+    </w:p>
+    <w:p>
+      <w:pPr>
+        <w:pStyle w:val="a9"/>
+        <w:numPr>
+          <w:ilvl w:val="0"/>
+          <w:numId w:val="2"/>
+        </w:numPr>
+        <w:spacing w:after="0"/>
+        <w:jc w:val="both"/>
+        <w:rPr>
+          <w:rFonts w:ascii="Times New Roman" w:hAnsi="Times New Roman" w:cs="Times New Roman"/>
+          <w:sz w:val="28"/>
+          <w:szCs w:val="28"/>
+          <w:lang w:val="en-US"/>
+        </w:rPr>
+      </w:pPr>
+      <w:r>
+        <w:rPr>
+          <w:rFonts w:ascii="Times New Roman" w:hAnsi="Times New Roman" w:cs="Times New Roman"/>
+          <w:sz w:val="28"/>
+          <w:szCs w:val="28"/>
+        </w:rPr>
+        <w:lastRenderedPageBreak/>
+        <w:t>Скріншот перевірки розгорнутого додатку у браузері:</w:t>
+      </w:r>
+    </w:p>
+    <w:p>
+      <w:pPr>
+        <w:spacing w:after="0"/>
+        <w:jc w:val="both"/>
+        <w:rPr>
+          <w:rFonts w:ascii="Times New Roman" w:hAnsi="Times New Roman" w:cs="Times New Roman"/>
+          <w:sz w:val="28"/>
+          <w:szCs w:val="28"/>
+        </w:rPr>
+      </w:pPr>
+    </w:p>
+    <w:p>
+      <w:pPr>
+        <w:spacing w:after="0"/>
+        <w:ind w:left="360"/>
+        <w:jc w:val="both"/>
+        <w:rPr>
+          <w:rFonts w:ascii="Times New Roman" w:hAnsi="Times New Roman" w:cs="Times New Roman"/>
+          <w:sz w:val="28"/>
+          <w:szCs w:val="28"/>
+        </w:rPr>
+      </w:pPr>
+      <w:r>
+        <w:rPr>
+          <w:lang w:val="en-US"/>
+        </w:rPr>
+        <w:drawing>
+          <wp:inline distT="0" distB="0" distL="0" distR="0" wp14:anchorId="3F34EB05" wp14:editId="51EC1D3B">
+            <wp:extent cx="5644379" cy="3175000"/>
+            <wp:effectExtent l="0" t="0" r="0" b="6350"/>
+            <wp:docPr id="451335195" name="Рисунок 1"/>
+            <wp:cNvGraphicFramePr>
+              <a:graphicFrameLocks xmlns:a="http://schemas.openxmlformats.org/drawingml/2006/main" noChangeAspect="1"/>
+            </wp:cNvGraphicFramePr>
+            <a:graphic xmlns:a="http://schemas.openxmlformats.org/drawingml/2006/main">
+              <a:graphicData uri="http://schemas.openxmlformats.org/drawingml/2006/picture">
+                <pic:pic xmlns:pic="http://schemas.openxmlformats.org/drawingml/2006/picture">
+                  <pic:nvPicPr>
+                    <pic:cNvPr id="451335195" name=""/>
+                    <pic:cNvPicPr/>
+                  </pic:nvPicPr>
+                  <pic:blipFill>
+                    <a:blip r:embed="rId7"/>
+                    <a:stretch>
+                      <a:fillRect/>
+                    </a:stretch>
+                  </pic:blipFill>
+                  <pic:spPr>
+                    <a:xfrm>
+                      <a:off x="0" y="0"/>
+                      <a:ext cx="5650361" cy="3178365"/>
+                    </a:xfrm>
+                    <a:prstGeom prst="rect">
+                      <a:avLst/>
+                    </a:prstGeom>
+                  </pic:spPr>
+                </pic:pic>
+              </a:graphicData>
+            </a:graphic>
+          </wp:inline>
+        </w:drawing>
+      </w:r>
+    </w:p>
+    <w:p>
+      <w:pPr>
+        <w:spacing w:after="0"/>
+        <w:ind w:left="360"/>
+        <w:jc w:val="both"/>
+        <w:rPr>
+          <w:rFonts w:ascii="Times New Roman" w:hAnsi="Times New Roman" w:cs="Times New Roman"/>
+          <w:sz w:val="28"/>
+          <w:szCs w:val="28"/>
+        </w:rPr>
+      </w:pPr>
+    </w:p>
+    <w:p>
+      <w:pPr>
+        <w:pStyle w:val="a9"/>
+        <w:numPr>
+          <w:ilvl w:val="0"/>
+          <w:numId w:val="2"/>
+        </w:numPr>
+        <w:spacing w:after="0"/>
+        <w:jc w:val="both"/>
+        <w:rPr>
+          <w:rFonts w:ascii="Times New Roman" w:hAnsi="Times New Roman" w:cs="Times New Roman"/>
+          <w:sz w:val="28"/>
+          <w:szCs w:val="28"/>
+        </w:rPr>
+      </w:pPr>
+      <w:r>
+        <w:rPr>
+          <w:rFonts w:ascii="Times New Roman" w:hAnsi="Times New Roman" w:cs="Times New Roman"/>
+          <w:sz w:val="28"/>
+          <w:szCs w:val="28"/>
+        </w:rPr>
+        <w:t xml:space="preserve">Посилання на код мого </w:t>
+      </w:r>
+      <w:proofErr w:type="spellStart"/>
+      <w:r>
+        <w:rPr>
+          <w:rFonts w:ascii="Times New Roman" w:hAnsi="Times New Roman" w:cs="Times New Roman"/>
+          <w:sz w:val="28"/>
+          <w:szCs w:val="28"/>
+        </w:rPr>
+        <w:t>проекту</w:t>
+      </w:r>
+      <w:proofErr w:type="spellEnd"/>
+      <w:r>
+        <w:rPr>
+          <w:rFonts w:ascii="Times New Roman" w:hAnsi="Times New Roman" w:cs="Times New Roman"/>
+          <w:sz w:val="28"/>
+          <w:szCs w:val="28"/>
+        </w:rPr>
+        <w:t>, що розміщений на віддаленому репозиторію:</w:t>
+      </w:r>
+    </w:p>
+    <w:p>
+      <w:pPr>
+        <w:spacing w:after="0"/>
+        <w:ind w:left="360"/>
+        <w:jc w:val="both"/>
+        <w:rPr>
+          <w:rFonts w:ascii="Times New Roman" w:hAnsi="Times New Roman" w:cs="Times New Roman"/>
+          <w:sz w:val="28"/>
+          <w:szCs w:val="28"/>
+        </w:rPr>
+      </w:pPr>
+    </w:p>
+    <w:p>
+      <w:pPr>
+        <w:spacing w:after="0"/>
+        <w:ind w:left="360"/>
+        <w:jc w:val="both"/>
+        <w:rPr>
+          <w:rFonts w:ascii="Times New Roman" w:hAnsi="Times New Roman" w:cs="Times New Roman"/>
+          <w:sz w:val="28"/>
+          <w:szCs w:val="28"/>
+        </w:rPr>
+      </w:pPr>
+      <w:hyperlink r:id="rId8" w:history="1">
+        <w:r>
+          <w:rPr>
+            <w:rStyle w:val="ae"/>
+            <w:rFonts w:ascii="Times New Roman" w:hAnsi="Times New Roman" w:cs="Times New Roman"/>
+            <w:sz w:val="28"/>
+            <w:szCs w:val="28"/>
+          </w:rPr>
+          <w:t>https://github.co</w:t>
+        </w:r>
+        <w:r>
+          <w:rPr>
+            <w:rStyle w:val="ae"/>
+            <w:rFonts w:ascii="Times New Roman" w:hAnsi="Times New Roman" w:cs="Times New Roman"/>
+            <w:sz w:val="28"/>
+            <w:szCs w:val="28"/>
+          </w:rPr>
+          <w:t>m</w:t>
+        </w:r>
+        <w:r>
+          <w:rPr>
+            <w:rStyle w:val="ae"/>
+            <w:rFonts w:ascii="Times New Roman" w:hAnsi="Times New Roman" w:cs="Times New Roman"/>
+            <w:sz w:val="28"/>
+            <w:szCs w:val="28"/>
+          </w:rPr>
+          <w:t>/martapolishchuk06/flask-app-lab</w:t>
+        </w:r>
+      </w:hyperlink>
+    </w:p>
+    <w:p>
+      <w:pPr>
+        <w:spacing w:after="0"/>
+        <w:ind w:left="360"/>
+        <w:jc w:val="both"/>
+        <w:rPr>
+          <w:rFonts w:ascii="Times New Roman" w:hAnsi="Times New Roman" w:cs="Times New Roman"/>
+          <w:sz w:val="28"/>
+          <w:szCs w:val="28"/>
         </w:rPr>
       </w:pPr>
     </w:p>
@@ -891,6 +1419,195 @@
     </w:sectPr>
   </w:body>
 </w:document>
+</file>
+
+<file path=word/numbering.xml><?xml version="1.0" encoding="utf-8"?>
+<w:numbering xmlns:wpc="http://schemas.microsoft.com/office/word/2010/wordprocessingCanvas" xmlns:cx="http://schemas.microsoft.com/office/drawing/2014/chartex" xmlns:cx1="http://schemas.microsoft.com/office/drawing/2015/9/8/chartex" xmlns:cx2="http://schemas.microsoft.com/office/drawing/2015/10/21/chartex" xmlns:cx3="http://schemas.microsoft.com/office/drawing/2016/5/9/chartex" xmlns:cx4="http://schemas.microsoft.com/office/drawing/2016/5/10/chartex" xmlns:cx5="http://schemas.microsoft.com/office/drawing/2016/5/11/chartex" xmlns:cx6="http://schemas.microsoft.com/office/drawing/2016/5/12/chartex" xmlns:cx7="http://schemas.microsoft.com/office/drawing/2016/5/13/chartex" xmlns:cx8="http://schemas.microsoft.com/office/drawing/2016/5/14/chartex" xmlns:mc="http://schemas.openxmlformats.org/markup-compatibility/2006" xmlns:aink="http://schemas.microsoft.com/office/drawing/2016/ink" xmlns:am3d="http://schemas.microsoft.com/office/drawing/2017/model3d" xmlns:o="urn:schemas-microsoft-com:office:office" xmlns:oel="http://schemas.microsoft.com/office/2019/extlst" xmlns:r="http://schemas.openxmlformats.org/officeDocument/2006/relationships" xmlns:m="http://schemas.openxmlformats.org/officeDocument/2006/math" xmlns:v="urn:schemas-microsoft-com:vml" xmlns:wp14="http://schemas.microsoft.com/office/word/2010/wordprocessingDrawing" xmlns:wp="http://schemas.openxmlformats.org/drawingml/2006/wordprocessingDrawing" xmlns:w10="urn:schemas-microsoft-com:office:word" xmlns:w="http://schemas.openxmlformats.org/wordprocessingml/2006/main" xmlns:w14="http://schemas.microsoft.com/office/word/2010/wordml" xmlns:w15="http://schemas.microsoft.com/office/word/2012/wordml" xmlns:w16cex="http://schemas.microsoft.com/office/word/2018/wordml/cex" xmlns:w16cid="http://schemas.microsoft.com/office/word/2016/wordml/cid" xmlns:w16="http://schemas.microsoft.com/office/word/2018/wordml" xmlns:w16du="http://schemas.microsoft.com/office/word/2023/wordml/word16du" xmlns:w16sdtdh="http://schemas.microsoft.com/office/word/2020/wordml/sdtdatahash" xmlns:w16sdtfl="http://schemas.microsoft.com/office/word/2024/wordml/sdtformatlock" xmlns:w16se="http://schemas.microsoft.com/office/word/2015/wordml/symex" xmlns:wpg="http://schemas.microsoft.com/office/word/2010/wordprocessingGroup" xmlns:wpi="http://schemas.microsoft.com/office/word/2010/wordprocessingInk" xmlns:wne="http://schemas.microsoft.com/office/word/2006/wordml" xmlns:wps="http://schemas.microsoft.com/office/word/2010/wordprocessingShape" mc:Ignorable="w14 w15 w16se w16cid w16 w16cex w16sdtdh w16sdtfl w16du wp14">
+  <w:abstractNum w:abstractNumId="0" w15:restartNumberingAfterBreak="0">
+    <w:nsid w:val="3F3A5267"/>
+    <w:multiLevelType w:val="hybridMultilevel"/>
+    <w:tmpl w:val="4016E502"/>
+    <w:lvl w:ilvl="0" w:tplc="0422000F">
+      <w:start w:val="1"/>
+      <w:numFmt w:val="decimal"/>
+      <w:lvlText w:val="%1."/>
+      <w:lvlJc w:val="left"/>
+      <w:pPr>
+        <w:ind w:left="720" w:hanging="360"/>
+      </w:pPr>
+      <w:rPr>
+        <w:rFonts w:hint="default"/>
+      </w:rPr>
+    </w:lvl>
+    <w:lvl w:ilvl="1" w:tplc="04220019" w:tentative="1">
+      <w:start w:val="1"/>
+      <w:numFmt w:val="lowerLetter"/>
+      <w:lvlText w:val="%2."/>
+      <w:lvlJc w:val="left"/>
+      <w:pPr>
+        <w:ind w:left="1440" w:hanging="360"/>
+      </w:pPr>
+    </w:lvl>
+    <w:lvl w:ilvl="2" w:tplc="0422001B" w:tentative="1">
+      <w:start w:val="1"/>
+      <w:numFmt w:val="lowerRoman"/>
+      <w:lvlText w:val="%3."/>
+      <w:lvlJc w:val="right"/>
+      <w:pPr>
+        <w:ind w:left="2160" w:hanging="180"/>
+      </w:pPr>
+    </w:lvl>
+    <w:lvl w:ilvl="3" w:tplc="0422000F" w:tentative="1">
+      <w:start w:val="1"/>
+      <w:numFmt w:val="decimal"/>
+      <w:lvlText w:val="%4."/>
+      <w:lvlJc w:val="left"/>
+      <w:pPr>
+        <w:ind w:left="2880" w:hanging="360"/>
+      </w:pPr>
+    </w:lvl>
+    <w:lvl w:ilvl="4" w:tplc="04220019" w:tentative="1">
+      <w:start w:val="1"/>
+      <w:numFmt w:val="lowerLetter"/>
+      <w:lvlText w:val="%5."/>
+      <w:lvlJc w:val="left"/>
+      <w:pPr>
+        <w:ind w:left="3600" w:hanging="360"/>
+      </w:pPr>
+    </w:lvl>
+    <w:lvl w:ilvl="5" w:tplc="0422001B" w:tentative="1">
+      <w:start w:val="1"/>
+      <w:numFmt w:val="lowerRoman"/>
+      <w:lvlText w:val="%6."/>
+      <w:lvlJc w:val="right"/>
+      <w:pPr>
+        <w:ind w:left="4320" w:hanging="180"/>
+      </w:pPr>
+    </w:lvl>
+    <w:lvl w:ilvl="6" w:tplc="0422000F" w:tentative="1">
+      <w:start w:val="1"/>
+      <w:numFmt w:val="decimal"/>
+      <w:lvlText w:val="%7."/>
+      <w:lvlJc w:val="left"/>
+      <w:pPr>
+        <w:ind w:left="5040" w:hanging="360"/>
+      </w:pPr>
+    </w:lvl>
+    <w:lvl w:ilvl="7" w:tplc="04220019" w:tentative="1">
+      <w:start w:val="1"/>
+      <w:numFmt w:val="lowerLetter"/>
+      <w:lvlText w:val="%8."/>
+      <w:lvlJc w:val="left"/>
+      <w:pPr>
+        <w:ind w:left="5760" w:hanging="360"/>
+      </w:pPr>
+    </w:lvl>
+    <w:lvl w:ilvl="8" w:tplc="0422001B" w:tentative="1">
+      <w:start w:val="1"/>
+      <w:numFmt w:val="lowerRoman"/>
+      <w:lvlText w:val="%9."/>
+      <w:lvlJc w:val="right"/>
+      <w:pPr>
+        <w:ind w:left="6480" w:hanging="180"/>
+      </w:pPr>
+    </w:lvl>
+  </w:abstractNum>
+  <w:abstractNum w:abstractNumId="1" w15:restartNumberingAfterBreak="0">
+    <w:nsid w:val="400A0DB4"/>
+    <w:multiLevelType w:val="hybridMultilevel"/>
+    <w:tmpl w:val="1FEE48AA"/>
+    <w:lvl w:ilvl="0" w:tplc="0422000F">
+      <w:start w:val="1"/>
+      <w:numFmt w:val="decimal"/>
+      <w:lvlText w:val="%1."/>
+      <w:lvlJc w:val="left"/>
+      <w:pPr>
+        <w:ind w:left="720" w:hanging="360"/>
+      </w:pPr>
+      <w:rPr>
+        <w:rFonts w:hint="default"/>
+      </w:rPr>
+    </w:lvl>
+    <w:lvl w:ilvl="1" w:tplc="04220019" w:tentative="1">
+      <w:start w:val="1"/>
+      <w:numFmt w:val="lowerLetter"/>
+      <w:lvlText w:val="%2."/>
+      <w:lvlJc w:val="left"/>
+      <w:pPr>
+        <w:ind w:left="1440" w:hanging="360"/>
+      </w:pPr>
+    </w:lvl>
+    <w:lvl w:ilvl="2" w:tplc="0422001B" w:tentative="1">
+      <w:start w:val="1"/>
+      <w:numFmt w:val="lowerRoman"/>
+      <w:lvlText w:val="%3."/>
+      <w:lvlJc w:val="right"/>
+      <w:pPr>
+        <w:ind w:left="2160" w:hanging="180"/>
+      </w:pPr>
+    </w:lvl>
+    <w:lvl w:ilvl="3" w:tplc="0422000F" w:tentative="1">
+      <w:start w:val="1"/>
+      <w:numFmt w:val="decimal"/>
+      <w:lvlText w:val="%4."/>
+      <w:lvlJc w:val="left"/>
+      <w:pPr>
+        <w:ind w:left="2880" w:hanging="360"/>
+      </w:pPr>
+    </w:lvl>
+    <w:lvl w:ilvl="4" w:tplc="04220019" w:tentative="1">
+      <w:start w:val="1"/>
+      <w:numFmt w:val="lowerLetter"/>
+      <w:lvlText w:val="%5."/>
+      <w:lvlJc w:val="left"/>
+      <w:pPr>
+        <w:ind w:left="3600" w:hanging="360"/>
+      </w:pPr>
+    </w:lvl>
+    <w:lvl w:ilvl="5" w:tplc="0422001B" w:tentative="1">
+      <w:start w:val="1"/>
+      <w:numFmt w:val="lowerRoman"/>
+      <w:lvlText w:val="%6."/>
+      <w:lvlJc w:val="right"/>
+      <w:pPr>
+        <w:ind w:left="4320" w:hanging="180"/>
+      </w:pPr>
+    </w:lvl>
+    <w:lvl w:ilvl="6" w:tplc="0422000F" w:tentative="1">
+      <w:start w:val="1"/>
+      <w:numFmt w:val="decimal"/>
+      <w:lvlText w:val="%7."/>
+      <w:lvlJc w:val="left"/>
+      <w:pPr>
+        <w:ind w:left="5040" w:hanging="360"/>
+      </w:pPr>
+    </w:lvl>
+    <w:lvl w:ilvl="7" w:tplc="04220019" w:tentative="1">
+      <w:start w:val="1"/>
+      <w:numFmt w:val="lowerLetter"/>
+      <w:lvlText w:val="%8."/>
+      <w:lvlJc w:val="left"/>
+      <w:pPr>
+        <w:ind w:left="5760" w:hanging="360"/>
+      </w:pPr>
+    </w:lvl>
+    <w:lvl w:ilvl="8" w:tplc="0422001B" w:tentative="1">
+      <w:start w:val="1"/>
+      <w:numFmt w:val="lowerRoman"/>
+      <w:lvlText w:val="%9."/>
+      <w:lvlJc w:val="right"/>
+      <w:pPr>
+        <w:ind w:left="6480" w:hanging="180"/>
+      </w:pPr>
+    </w:lvl>
+  </w:abstractNum>
+  <w:num w:numId="1" w16cid:durableId="1276328023">
+    <w:abstractNumId w:val="0"/>
+  </w:num>
+  <w:num w:numId="2" w16cid:durableId="1567378113">
+    <w:abstractNumId w:val="1"/>
+  </w:num>
+</w:numbering>
 </file>
 
 <file path=word/styles.xml><?xml version="1.0" encoding="utf-8"?>
@@ -1810,6 +2527,41 @@
       <w:spacing w:val="5"/>
     </w:rPr>
   </w:style>
+  <w:style w:type="character" w:styleId="ae">
+    <w:name w:val="Hyperlink"/>
+    <w:basedOn w:val="a0"/>
+    <w:uiPriority w:val="99"/>
+    <w:unhideWhenUsed/>
+    <w:rsid w:val="008E7643"/>
+    <w:rPr>
+      <w:color w:val="0563C1" w:themeColor="hyperlink"/>
+      <w:u w:val="single"/>
+    </w:rPr>
+  </w:style>
+  <w:style w:type="character" w:styleId="af">
+    <w:name w:val="Unresolved Mention"/>
+    <w:basedOn w:val="a0"/>
+    <w:uiPriority w:val="99"/>
+    <w:semiHidden/>
+    <w:unhideWhenUsed/>
+    <w:rsid w:val="008E7643"/>
+    <w:rPr>
+      <w:color w:val="605E5C"/>
+      <w:shd w:val="clear" w:color="auto" w:fill="E1DFDD"/>
+    </w:rPr>
+  </w:style>
+  <w:style w:type="character" w:styleId="af0">
+    <w:name w:val="FollowedHyperlink"/>
+    <w:basedOn w:val="a0"/>
+    <w:uiPriority w:val="99"/>
+    <w:semiHidden/>
+    <w:unhideWhenUsed/>
+    <w:rsid w:val="008E7643"/>
+    <w:rPr>
+      <w:color w:val="954F72" w:themeColor="followedHyperlink"/>
+      <w:u w:val="single"/>
+    </w:rPr>
+  </w:style>
 </w:styles>
 </file>
 

</xml_diff>